<commit_message>
Test plans: expected results for expired stock being written off and replaced
Co-Authored-By: Claude Opus 5.5 <noreply@anthropic.com>
</commit_message>
<xml_diff>
--- a/QA/FETCH-System-Test-Plan-updated.docx
+++ b/QA/FETCH-System-Test-Plan-updated.docx
@@ -12879,7 +12879,7 @@
                 <w:sz w:val="16"/>
                 <w:szCs w:val="16"/>
               </w:rPr>
-              <w:t xml:space="preserve">Successfully added the stock and set the new expiration date; the expiration date field is required for an expired product</w:t>
+              <w:t xml:space="preserve">Successfully removed the expired stock, put the new stock in its place and set the new expiration date; the expiration date field is required for an expired product</w:t>
             </w:r>
           </w:p>
         </w:tc>
@@ -24999,7 +24999,7 @@
                 <w:sz w:val="16"/>
                 <w:szCs w:val="16"/>
               </w:rPr>
-              <w:t xml:space="preserve">Successfully received the order, added the quantities to stock and set the new expiration date; for a product that has already expired the date must be entered</w:t>
+              <w:t xml:space="preserve">Successfully received the order, added the quantities to stock and set the new expiration date; for a product that has already expired the date must be entered and the expired stock is removed and replaced by the new batch</w:t>
             </w:r>
           </w:p>
         </w:tc>

</xml_diff>

<commit_message>
Test plans: the new product form messages, and UAT edits
- Unit, System and UAT cases for the product form now expect FETCH's own
  message under each field instead of the browser's tooltip, with new
  cases for a SKU or barcode with spaces, 3 decimals in a price, stock in
  pieces that is not whole, a name of 1 letter, cost above the unit price,
  and max stock not above the reorder level (Unit plan: 269 cases)
- UAT: fields listed in the new form's order; the offline case moved to
  the product steps; Dashboard revenue equals Sales total; more in the
  cart than in stock (Administrator 61, Cashier 27, Supplier 26)

Co-Authored-By: Claude Opus 5.5 <noreply@anthropic.com>
</commit_message>
<xml_diff>
--- a/QA/FETCH-System-Test-Plan-updated.docx
+++ b/QA/FETCH-System-Test-Plan-updated.docx
@@ -10864,7 +10864,312 @@
                 <w:sz w:val="16"/>
                 <w:szCs w:val="16"/>
               </w:rPr>
-              <w:t xml:space="preserve">Enter the SKU, Product name, Category, Unit price and Supplier, then click the Save product button</w:t>
+              <w:t xml:space="preserve">Click the Save product button with the form empty</w:t>
+            </w:r>
+          </w:p>
+        </w:tc>
+        <w:tc>
+          <w:tcPr>
+            <w:tcW w:type="dxa" w:w="3820"/>
+            <w:tcBorders>
+              <w:top w:val="single" w:color="808080" w:sz="4"/>
+              <w:left w:val="single" w:color="808080" w:sz="4"/>
+              <w:bottom w:val="single" w:color="808080" w:sz="4"/>
+              <w:right w:val="single" w:color="808080" w:sz="4"/>
+            </w:tcBorders>
+            <w:tcMar>
+              <w:top w:type="dxa" w:w="45"/>
+              <w:left w:type="dxa" w:w="80"/>
+              <w:bottom w:type="dxa" w:w="45"/>
+              <w:right w:type="dxa" w:w="80"/>
+            </w:tcMar>
+            <w:vAlign w:val="center"/>
+          </w:tcPr>
+          <w:p>
+            <w:pPr>
+              <w:spacing w:after="0" w:line="230"/>
+              <w:jc w:val="left"/>
+            </w:pPr>
+            <w:r>
+              <w:rPr>
+                <w:rFonts w:ascii="Arial" w:cs="Arial" w:eastAsia="Arial" w:hAnsi="Arial"/>
+                <w:color w:val="000000"/>
+                <w:sz w:val="16"/>
+                <w:szCs w:val="16"/>
+              </w:rPr>
+              <w:t xml:space="preserve">Successfully displayed a message under each required field saying what is missing</w:t>
+            </w:r>
+          </w:p>
+        </w:tc>
+        <w:tc>
+          <w:tcPr>
+            <w:tcW w:type="dxa" w:w="1300"/>
+            <w:tcBorders>
+              <w:top w:val="single" w:color="808080" w:sz="4"/>
+              <w:left w:val="single" w:color="808080" w:sz="4"/>
+              <w:bottom w:val="single" w:color="808080" w:sz="4"/>
+              <w:right w:val="single" w:color="808080" w:sz="4"/>
+            </w:tcBorders>
+            <w:tcMar>
+              <w:top w:type="dxa" w:w="45"/>
+              <w:left w:type="dxa" w:w="80"/>
+              <w:bottom w:type="dxa" w:w="45"/>
+              <w:right w:type="dxa" w:w="80"/>
+            </w:tcMar>
+            <w:vAlign w:val="center"/>
+          </w:tcPr>
+          <w:p>
+            <w:pPr>
+              <w:spacing w:after="0" w:line="230"/>
+              <w:jc w:val="left"/>
+            </w:pPr>
+            <w:r>
+              <w:rPr>
+                <w:rFonts w:ascii="Arial" w:cs="Arial" w:eastAsia="Arial" w:hAnsi="Arial"/>
+                <w:color w:val="000000"/>
+                <w:sz w:val="16"/>
+                <w:szCs w:val="16"/>
+              </w:rPr>
+              <w:t xml:space="preserve"/>
+            </w:r>
+          </w:p>
+        </w:tc>
+        <w:tc>
+          <w:tcPr>
+            <w:tcW w:type="dxa" w:w="900"/>
+            <w:tcBorders>
+              <w:top w:val="single" w:color="808080" w:sz="4"/>
+              <w:left w:val="single" w:color="808080" w:sz="4"/>
+              <w:bottom w:val="single" w:color="808080" w:sz="4"/>
+              <w:right w:val="single" w:color="808080" w:sz="4"/>
+            </w:tcBorders>
+            <w:tcMar>
+              <w:top w:type="dxa" w:w="45"/>
+              <w:left w:type="dxa" w:w="80"/>
+              <w:bottom w:type="dxa" w:w="45"/>
+              <w:right w:type="dxa" w:w="80"/>
+            </w:tcMar>
+            <w:vAlign w:val="center"/>
+          </w:tcPr>
+          <w:p>
+            <w:pPr>
+              <w:spacing w:after="0" w:line="230"/>
+              <w:jc w:val="left"/>
+            </w:pPr>
+            <w:r>
+              <w:rPr>
+                <w:rFonts w:ascii="Arial" w:cs="Arial" w:eastAsia="Arial" w:hAnsi="Arial"/>
+                <w:color w:val="000000"/>
+                <w:sz w:val="16"/>
+                <w:szCs w:val="16"/>
+              </w:rPr>
+              <w:t xml:space="preserve"/>
+            </w:r>
+          </w:p>
+        </w:tc>
+        <w:tc>
+          <w:tcPr>
+            <w:tcW w:type="dxa" w:w="1220"/>
+            <w:tcBorders>
+              <w:top w:val="single" w:color="808080" w:sz="4"/>
+              <w:left w:val="single" w:color="808080" w:sz="4"/>
+              <w:bottom w:val="single" w:color="808080" w:sz="4"/>
+              <w:right w:val="single" w:color="808080" w:sz="4"/>
+            </w:tcBorders>
+            <w:tcMar>
+              <w:top w:type="dxa" w:w="45"/>
+              <w:left w:type="dxa" w:w="80"/>
+              <w:bottom w:type="dxa" w:w="45"/>
+              <w:right w:type="dxa" w:w="80"/>
+            </w:tcMar>
+            <w:vAlign w:val="center"/>
+          </w:tcPr>
+          <w:p>
+            <w:pPr>
+              <w:spacing w:after="0" w:line="230"/>
+              <w:jc w:val="left"/>
+            </w:pPr>
+            <w:r>
+              <w:rPr>
+                <w:rFonts w:ascii="Arial" w:cs="Arial" w:eastAsia="Arial" w:hAnsi="Arial"/>
+                <w:color w:val="000000"/>
+                <w:sz w:val="16"/>
+                <w:szCs w:val="16"/>
+              </w:rPr>
+              <w:t xml:space="preserve"/>
+            </w:r>
+          </w:p>
+        </w:tc>
+      </w:tr>
+      <w:tr>
+        <w:trPr>
+          <w:cantSplit/>
+        </w:trPr>
+        <w:tc>
+          <w:tcPr>
+            <w:tcW w:type="dxa" w:w="1000"/>
+            <w:tcBorders>
+              <w:top w:val="single" w:color="808080" w:sz="4"/>
+              <w:left w:val="single" w:color="808080" w:sz="4"/>
+              <w:bottom w:val="single" w:color="808080" w:sz="4"/>
+              <w:right w:val="single" w:color="808080" w:sz="4"/>
+            </w:tcBorders>
+            <w:shd w:fill="1E4D2B" w:val="clear"/>
+            <w:tcMar>
+              <w:top w:type="dxa" w:w="45"/>
+              <w:left w:type="dxa" w:w="80"/>
+              <w:bottom w:type="dxa" w:w="45"/>
+              <w:right w:type="dxa" w:w="80"/>
+            </w:tcMar>
+            <w:vAlign w:val="center"/>
+          </w:tcPr>
+          <w:p>
+            <w:pPr>
+              <w:spacing w:after="0" w:line="230"/>
+              <w:jc w:val="left"/>
+            </w:pPr>
+            <w:r>
+              <w:rPr>
+                <w:rFonts w:ascii="Arial" w:cs="Arial" w:eastAsia="Arial" w:hAnsi="Arial"/>
+                <w:color w:val="000000"/>
+                <w:sz w:val="16"/>
+                <w:szCs w:val="16"/>
+              </w:rPr>
+              <w:t xml:space="preserve"/>
+            </w:r>
+          </w:p>
+        </w:tc>
+        <w:tc>
+          <w:tcPr>
+            <w:tcW w:type="dxa" w:w="520"/>
+            <w:tcBorders>
+              <w:top w:val="single" w:color="808080" w:sz="4"/>
+              <w:left w:val="single" w:color="808080" w:sz="4"/>
+              <w:bottom w:val="single" w:color="808080" w:sz="4"/>
+              <w:right w:val="single" w:color="808080" w:sz="4"/>
+            </w:tcBorders>
+            <w:tcMar>
+              <w:top w:type="dxa" w:w="45"/>
+              <w:left w:type="dxa" w:w="80"/>
+              <w:bottom w:type="dxa" w:w="45"/>
+              <w:right w:type="dxa" w:w="80"/>
+            </w:tcMar>
+            <w:vAlign w:val="center"/>
+          </w:tcPr>
+          <w:p>
+            <w:pPr>
+              <w:spacing w:after="0" w:line="230"/>
+              <w:jc w:val="center"/>
+            </w:pPr>
+            <w:r>
+              <w:rPr>
+                <w:rFonts w:ascii="Arial" w:cs="Arial" w:eastAsia="Arial" w:hAnsi="Arial"/>
+                <w:color w:val="000000"/>
+                <w:sz w:val="16"/>
+                <w:szCs w:val="16"/>
+              </w:rPr>
+              <w:t xml:space="preserve">5</w:t>
+            </w:r>
+          </w:p>
+        </w:tc>
+        <w:tc>
+          <w:tcPr>
+            <w:tcW w:type="dxa" w:w="1100"/>
+            <w:tcBorders>
+              <w:top w:val="single" w:color="808080" w:sz="4"/>
+              <w:left w:val="single" w:color="808080" w:sz="4"/>
+              <w:bottom w:val="single" w:color="808080" w:sz="4"/>
+              <w:right w:val="single" w:color="808080" w:sz="4"/>
+            </w:tcBorders>
+            <w:tcMar>
+              <w:top w:type="dxa" w:w="45"/>
+              <w:left w:type="dxa" w:w="80"/>
+              <w:bottom w:type="dxa" w:w="45"/>
+              <w:right w:type="dxa" w:w="80"/>
+            </w:tcMar>
+            <w:vAlign w:val="center"/>
+          </w:tcPr>
+          <w:p>
+            <w:pPr>
+              <w:spacing w:after="0" w:line="230"/>
+              <w:jc w:val="left"/>
+            </w:pPr>
+            <w:r>
+              <w:rPr>
+                <w:rFonts w:ascii="Arial" w:cs="Arial" w:eastAsia="Arial" w:hAnsi="Arial"/>
+                <w:b w:val="false"/>
+                <w:bCs w:val="false"/>
+                <w:color w:val="000000"/>
+                <w:sz w:val="16"/>
+                <w:szCs w:val="16"/>
+              </w:rPr>
+              <w:t xml:space="preserve"/>
+            </w:r>
+          </w:p>
+        </w:tc>
+        <w:tc>
+          <w:tcPr>
+            <w:tcW w:type="dxa" w:w="720"/>
+            <w:tcBorders>
+              <w:top w:val="single" w:color="808080" w:sz="4"/>
+              <w:left w:val="single" w:color="808080" w:sz="4"/>
+              <w:bottom w:val="single" w:color="808080" w:sz="4"/>
+              <w:right w:val="single" w:color="808080" w:sz="4"/>
+            </w:tcBorders>
+            <w:tcMar>
+              <w:top w:type="dxa" w:w="45"/>
+              <w:left w:type="dxa" w:w="80"/>
+              <w:bottom w:type="dxa" w:w="45"/>
+              <w:right w:type="dxa" w:w="80"/>
+            </w:tcMar>
+            <w:vAlign w:val="center"/>
+          </w:tcPr>
+          <w:p>
+            <w:pPr>
+              <w:spacing w:after="0" w:line="230"/>
+              <w:jc w:val="center"/>
+            </w:pPr>
+            <w:r>
+              <w:rPr>
+                <w:rFonts w:ascii="Arial" w:cs="Arial" w:eastAsia="Arial" w:hAnsi="Arial"/>
+                <w:color w:val="000000"/>
+                <w:sz w:val="16"/>
+                <w:szCs w:val="16"/>
+              </w:rPr>
+              <w:t xml:space="preserve">11-05</w:t>
+            </w:r>
+          </w:p>
+        </w:tc>
+        <w:tc>
+          <w:tcPr>
+            <w:tcW w:type="dxa" w:w="3820"/>
+            <w:tcBorders>
+              <w:top w:val="single" w:color="808080" w:sz="4"/>
+              <w:left w:val="single" w:color="808080" w:sz="4"/>
+              <w:bottom w:val="single" w:color="808080" w:sz="4"/>
+              <w:right w:val="single" w:color="808080" w:sz="4"/>
+            </w:tcBorders>
+            <w:tcMar>
+              <w:top w:type="dxa" w:w="45"/>
+              <w:left w:type="dxa" w:w="80"/>
+              <w:bottom w:type="dxa" w:w="45"/>
+              <w:right w:type="dxa" w:w="80"/>
+            </w:tcMar>
+            <w:vAlign w:val="center"/>
+          </w:tcPr>
+          <w:p>
+            <w:pPr>
+              <w:spacing w:after="0" w:line="230"/>
+              <w:jc w:val="left"/>
+            </w:pPr>
+            <w:r>
+              <w:rPr>
+                <w:rFonts w:ascii="Arial" w:cs="Arial" w:eastAsia="Arial" w:hAnsi="Arial"/>
+                <w:color w:val="000000"/>
+                <w:sz w:val="16"/>
+                <w:szCs w:val="16"/>
+              </w:rPr>
+              <w:t xml:space="preserve">Enter the Product name, Category, SKU, Unit price, Stock on hand, Reorder level and Supplier, then click the Save product button</w:t>
             </w:r>
           </w:p>
         </w:tc>

</xml_diff>

<commit_message>
Test plans: the SKU is chosen through the product type, not typed
Cases that typed a SKU now choose the Product type; 'SKU left empty'
became 'Product type not chosen', 'SKU with a space' became 'the SKU
cannot be typed', and 'SKU already used' became 'a saved product's SKU
cannot be changed'. The confirmation shows the SKU given. PDFs exported
from Word, including the Administrator and Cashier UATs that were behind.

Co-Authored-By: Claude Opus 5.5 <noreply@anthropic.com>
</commit_message>
<xml_diff>
--- a/QA/FETCH-System-Test-Plan-updated.docx
+++ b/QA/FETCH-System-Test-Plan-updated.docx
@@ -11169,7 +11169,7 @@
                 <w:sz w:val="16"/>
                 <w:szCs w:val="16"/>
               </w:rPr>
-              <w:t xml:space="preserve">Enter the Product name, Category, SKU, Unit price, Stock on hand, Reorder level and Supplier, then click the Save product button</w:t>
+              <w:t>Enter the Product name and Category, choose the Product type (the SKU fills in by itself), enter the Unit price, Stock on hand and Reorder level, choose the Supplier, then click the Save product button</w:t>
             </w:r>
           </w:p>
         </w:tc>
@@ -11202,7 +11202,7 @@
                 <w:sz w:val="16"/>
                 <w:szCs w:val="16"/>
               </w:rPr>
-              <w:t xml:space="preserve">Successfully added the product and displayed "Product added"</w:t>
+              <w:t>Successfully added the product and displayed "Product added" with the SKU it was given, for example DRY-121</w:t>
             </w:r>
           </w:p>
         </w:tc>

</xml_diff>